<commit_message>
Add subset/superset analysis and configuration table for high Brand Success (BSUC)
- Table 13a: intermediate-solution subset/superset analysis (consistency, PRI,
  coverage for all condition combinations; UE*UX*BSAT highest consistency .857)
- Table 13b: Fiss-style configuration analysis for high Brand Success (BSUC) in
  the metaverse (core conditions, coverage, consistency)
- New script analysis/04b_subset_superset.py and CSV outputs
- Updated RESULTS.md and Results_BSRS.docx (18 tables, TNR 12pt)
</commit_message>
<xml_diff>
--- a/Results_BSRS.docx
+++ b/Results_BSRS.docx
@@ -11565,6 +11565,1226 @@
           <w:sz w:val="22"/>
         </w:rPr>
         <w:t>Figure 12. Truth-table configurations ranked by sufficiency consistency (green = coded sufficient for high BSUC).</w:t>
+      </w:r>
+    </w:p>
+    <w:p>
+      <w:pPr>
+        <w:spacing w:after="160"/>
+        <w:jc w:val="both"/>
+      </w:pPr>
+      <w:r>
+        <w:rPr>
+          <w:rFonts w:ascii="Times New Roman" w:hAnsi="Times New Roman"/>
+          <w:i w:val="0"/>
+          <w:sz w:val="24"/>
+        </w:rPr>
+        <w:t>To make the logic underlying the intermediate solution transparent, Table 13a reports the subset/superset analysis. Each row is a candidate sufficient term formed by the logical AND of the presence of the indicated conditions; less restrictive expressions (fewer conditions) are supersets and more restrictive ones (more conditions) are subsets. The analysis exhibits the canonical consistency–coverage trade-off: as conditions are added, consistency rises while coverage falls. The full conjunction UE · UX · BSAT attains the highest consistency (0.857) and satisfies both the 0.80 raw-consistency and 0.70 PRI thresholds, which is why it is retained; satisfaction alone (BSAT) has the highest coverage (0.751) but a PRI (0.661) below threshold, confirming that satisfaction is empirically important yet not, on its own, a trustworthy sufficient recipe.</w:t>
+      </w:r>
+    </w:p>
+    <w:p>
+      <w:pPr>
+        <w:spacing w:after="80"/>
+      </w:pPr>
+      <w:r>
+        <w:rPr>
+          <w:rFonts w:ascii="Times New Roman" w:hAnsi="Times New Roman"/>
+          <w:b/>
+          <w:sz w:val="22"/>
+        </w:rPr>
+        <w:t>Table 13a. Intermediate solution — subset/superset analysis (outcome = high Brand Success, BSUC).</w:t>
+      </w:r>
+    </w:p>
+    <w:tbl>
+      <w:tblPr>
+        <w:tblStyle w:val="TableGrid"/>
+        <w:tblW w:type="auto" w:w="0"/>
+        <w:jc w:val="center"/>
+        <w:tblLook w:firstColumn="1" w:firstRow="1" w:lastColumn="0" w:lastRow="0" w:noHBand="0" w:noVBand="1" w:val="04A0"/>
+      </w:tblPr>
+      <w:tblGrid>
+        <w:gridCol w:w="1728"/>
+        <w:gridCol w:w="1728"/>
+        <w:gridCol w:w="1728"/>
+        <w:gridCol w:w="1728"/>
+        <w:gridCol w:w="1728"/>
+      </w:tblGrid>
+      <w:tr>
+        <w:tc>
+          <w:tcPr>
+            <w:tcW w:type="dxa" w:w="1728"/>
+            <w:shd w:val="clear" w:color="auto" w:fill="DDDDDD"/>
+          </w:tcPr>
+          <w:p>
+            <w:pPr>
+              <w:spacing w:after="40" w:before="40"/>
+            </w:pPr>
+            <w:r>
+              <w:rPr>
+                <w:rFonts w:ascii="Times New Roman" w:hAnsi="Times New Roman"/>
+                <w:b/>
+                <w:sz w:val="20"/>
+              </w:rPr>
+              <w:t>Combination</w:t>
+            </w:r>
+          </w:p>
+        </w:tc>
+        <w:tc>
+          <w:tcPr>
+            <w:tcW w:type="dxa" w:w="1728"/>
+            <w:shd w:val="clear" w:color="auto" w:fill="DDDDDD"/>
+          </w:tcPr>
+          <w:p>
+            <w:pPr>
+              <w:spacing w:after="40" w:before="40"/>
+              <w:jc w:val="center"/>
+            </w:pPr>
+            <w:r>
+              <w:rPr>
+                <w:rFonts w:ascii="Times New Roman" w:hAnsi="Times New Roman"/>
+                <w:b/>
+                <w:sz w:val="20"/>
+              </w:rPr>
+              <w:t># conditions</w:t>
+            </w:r>
+          </w:p>
+        </w:tc>
+        <w:tc>
+          <w:tcPr>
+            <w:tcW w:type="dxa" w:w="1728"/>
+            <w:shd w:val="clear" w:color="auto" w:fill="DDDDDD"/>
+          </w:tcPr>
+          <w:p>
+            <w:pPr>
+              <w:spacing w:after="40" w:before="40"/>
+              <w:jc w:val="center"/>
+            </w:pPr>
+            <w:r>
+              <w:rPr>
+                <w:rFonts w:ascii="Times New Roman" w:hAnsi="Times New Roman"/>
+                <w:b/>
+                <w:sz w:val="20"/>
+              </w:rPr>
+              <w:t>Raw consistency</w:t>
+            </w:r>
+          </w:p>
+        </w:tc>
+        <w:tc>
+          <w:tcPr>
+            <w:tcW w:type="dxa" w:w="1728"/>
+            <w:shd w:val="clear" w:color="auto" w:fill="DDDDDD"/>
+          </w:tcPr>
+          <w:p>
+            <w:pPr>
+              <w:spacing w:after="40" w:before="40"/>
+              <w:jc w:val="center"/>
+            </w:pPr>
+            <w:r>
+              <w:rPr>
+                <w:rFonts w:ascii="Times New Roman" w:hAnsi="Times New Roman"/>
+                <w:b/>
+                <w:sz w:val="20"/>
+              </w:rPr>
+              <w:t>PRI consistency</w:t>
+            </w:r>
+          </w:p>
+        </w:tc>
+        <w:tc>
+          <w:tcPr>
+            <w:tcW w:type="dxa" w:w="1728"/>
+            <w:shd w:val="clear" w:color="auto" w:fill="DDDDDD"/>
+          </w:tcPr>
+          <w:p>
+            <w:pPr>
+              <w:spacing w:after="40" w:before="40"/>
+              <w:jc w:val="center"/>
+            </w:pPr>
+            <w:r>
+              <w:rPr>
+                <w:rFonts w:ascii="Times New Roman" w:hAnsi="Times New Roman"/>
+                <w:b/>
+                <w:sz w:val="20"/>
+              </w:rPr>
+              <w:t>Raw coverage</w:t>
+            </w:r>
+          </w:p>
+        </w:tc>
+      </w:tr>
+      <w:tr>
+        <w:tc>
+          <w:tcPr>
+            <w:tcW w:type="dxa" w:w="1728"/>
+          </w:tcPr>
+          <w:p>
+            <w:pPr>
+              <w:spacing w:after="40" w:before="40"/>
+            </w:pPr>
+            <w:r>
+              <w:rPr>
+                <w:rFonts w:ascii="Times New Roman" w:hAnsi="Times New Roman"/>
+                <w:b w:val="0"/>
+                <w:sz w:val="20"/>
+              </w:rPr>
+              <w:t>UE · UX · BSAT</w:t>
+            </w:r>
+          </w:p>
+        </w:tc>
+        <w:tc>
+          <w:tcPr>
+            <w:tcW w:type="dxa" w:w="1728"/>
+          </w:tcPr>
+          <w:p>
+            <w:pPr>
+              <w:spacing w:after="40" w:before="40"/>
+              <w:jc w:val="center"/>
+            </w:pPr>
+            <w:r>
+              <w:rPr>
+                <w:rFonts w:ascii="Times New Roman" w:hAnsi="Times New Roman"/>
+                <w:b w:val="0"/>
+                <w:sz w:val="20"/>
+              </w:rPr>
+              <w:t>3</w:t>
+            </w:r>
+          </w:p>
+        </w:tc>
+        <w:tc>
+          <w:tcPr>
+            <w:tcW w:type="dxa" w:w="1728"/>
+          </w:tcPr>
+          <w:p>
+            <w:pPr>
+              <w:spacing w:after="40" w:before="40"/>
+              <w:jc w:val="center"/>
+            </w:pPr>
+            <w:r>
+              <w:rPr>
+                <w:rFonts w:ascii="Times New Roman" w:hAnsi="Times New Roman"/>
+                <w:b w:val="0"/>
+                <w:sz w:val="20"/>
+              </w:rPr>
+              <w:t>0.857</w:t>
+            </w:r>
+          </w:p>
+        </w:tc>
+        <w:tc>
+          <w:tcPr>
+            <w:tcW w:type="dxa" w:w="1728"/>
+          </w:tcPr>
+          <w:p>
+            <w:pPr>
+              <w:spacing w:after="40" w:before="40"/>
+              <w:jc w:val="center"/>
+            </w:pPr>
+            <w:r>
+              <w:rPr>
+                <w:rFonts w:ascii="Times New Roman" w:hAnsi="Times New Roman"/>
+                <w:b w:val="0"/>
+                <w:sz w:val="20"/>
+              </w:rPr>
+              <w:t>0.737</w:t>
+            </w:r>
+          </w:p>
+        </w:tc>
+        <w:tc>
+          <w:tcPr>
+            <w:tcW w:type="dxa" w:w="1728"/>
+          </w:tcPr>
+          <w:p>
+            <w:pPr>
+              <w:spacing w:after="40" w:before="40"/>
+              <w:jc w:val="center"/>
+            </w:pPr>
+            <w:r>
+              <w:rPr>
+                <w:rFonts w:ascii="Times New Roman" w:hAnsi="Times New Roman"/>
+                <w:b w:val="0"/>
+                <w:sz w:val="20"/>
+              </w:rPr>
+              <w:t>0.497</w:t>
+            </w:r>
+          </w:p>
+        </w:tc>
+      </w:tr>
+      <w:tr>
+        <w:tc>
+          <w:tcPr>
+            <w:tcW w:type="dxa" w:w="1728"/>
+          </w:tcPr>
+          <w:p>
+            <w:pPr>
+              <w:spacing w:after="40" w:before="40"/>
+            </w:pPr>
+            <w:r>
+              <w:rPr>
+                <w:rFonts w:ascii="Times New Roman" w:hAnsi="Times New Roman"/>
+                <w:b w:val="0"/>
+                <w:sz w:val="20"/>
+              </w:rPr>
+              <w:t>UE · BSAT</w:t>
+            </w:r>
+          </w:p>
+        </w:tc>
+        <w:tc>
+          <w:tcPr>
+            <w:tcW w:type="dxa" w:w="1728"/>
+          </w:tcPr>
+          <w:p>
+            <w:pPr>
+              <w:spacing w:after="40" w:before="40"/>
+              <w:jc w:val="center"/>
+            </w:pPr>
+            <w:r>
+              <w:rPr>
+                <w:rFonts w:ascii="Times New Roman" w:hAnsi="Times New Roman"/>
+                <w:b w:val="0"/>
+                <w:sz w:val="20"/>
+              </w:rPr>
+              <w:t>2</w:t>
+            </w:r>
+          </w:p>
+        </w:tc>
+        <w:tc>
+          <w:tcPr>
+            <w:tcW w:type="dxa" w:w="1728"/>
+          </w:tcPr>
+          <w:p>
+            <w:pPr>
+              <w:spacing w:after="40" w:before="40"/>
+              <w:jc w:val="center"/>
+            </w:pPr>
+            <w:r>
+              <w:rPr>
+                <w:rFonts w:ascii="Times New Roman" w:hAnsi="Times New Roman"/>
+                <w:b w:val="0"/>
+                <w:sz w:val="20"/>
+              </w:rPr>
+              <w:t>0.839</w:t>
+            </w:r>
+          </w:p>
+        </w:tc>
+        <w:tc>
+          <w:tcPr>
+            <w:tcW w:type="dxa" w:w="1728"/>
+          </w:tcPr>
+          <w:p>
+            <w:pPr>
+              <w:spacing w:after="40" w:before="40"/>
+              <w:jc w:val="center"/>
+            </w:pPr>
+            <w:r>
+              <w:rPr>
+                <w:rFonts w:ascii="Times New Roman" w:hAnsi="Times New Roman"/>
+                <w:b w:val="0"/>
+                <w:sz w:val="20"/>
+              </w:rPr>
+              <w:t>0.725</w:t>
+            </w:r>
+          </w:p>
+        </w:tc>
+        <w:tc>
+          <w:tcPr>
+            <w:tcW w:type="dxa" w:w="1728"/>
+          </w:tcPr>
+          <w:p>
+            <w:pPr>
+              <w:spacing w:after="40" w:before="40"/>
+              <w:jc w:val="center"/>
+            </w:pPr>
+            <w:r>
+              <w:rPr>
+                <w:rFonts w:ascii="Times New Roman" w:hAnsi="Times New Roman"/>
+                <w:b w:val="0"/>
+                <w:sz w:val="20"/>
+              </w:rPr>
+              <w:t>0.573</w:t>
+            </w:r>
+          </w:p>
+        </w:tc>
+      </w:tr>
+      <w:tr>
+        <w:tc>
+          <w:tcPr>
+            <w:tcW w:type="dxa" w:w="1728"/>
+          </w:tcPr>
+          <w:p>
+            <w:pPr>
+              <w:spacing w:after="40" w:before="40"/>
+            </w:pPr>
+            <w:r>
+              <w:rPr>
+                <w:rFonts w:ascii="Times New Roman" w:hAnsi="Times New Roman"/>
+                <w:b w:val="0"/>
+                <w:sz w:val="20"/>
+              </w:rPr>
+              <w:t>UX · BSAT</w:t>
+            </w:r>
+          </w:p>
+        </w:tc>
+        <w:tc>
+          <w:tcPr>
+            <w:tcW w:type="dxa" w:w="1728"/>
+          </w:tcPr>
+          <w:p>
+            <w:pPr>
+              <w:spacing w:after="40" w:before="40"/>
+              <w:jc w:val="center"/>
+            </w:pPr>
+            <w:r>
+              <w:rPr>
+                <w:rFonts w:ascii="Times New Roman" w:hAnsi="Times New Roman"/>
+                <w:b w:val="0"/>
+                <w:sz w:val="20"/>
+              </w:rPr>
+              <w:t>2</w:t>
+            </w:r>
+          </w:p>
+        </w:tc>
+        <w:tc>
+          <w:tcPr>
+            <w:tcW w:type="dxa" w:w="1728"/>
+          </w:tcPr>
+          <w:p>
+            <w:pPr>
+              <w:spacing w:after="40" w:before="40"/>
+              <w:jc w:val="center"/>
+            </w:pPr>
+            <w:r>
+              <w:rPr>
+                <w:rFonts w:ascii="Times New Roman" w:hAnsi="Times New Roman"/>
+                <w:b w:val="0"/>
+                <w:sz w:val="20"/>
+              </w:rPr>
+              <w:t>0.829</w:t>
+            </w:r>
+          </w:p>
+        </w:tc>
+        <w:tc>
+          <w:tcPr>
+            <w:tcW w:type="dxa" w:w="1728"/>
+          </w:tcPr>
+          <w:p>
+            <w:pPr>
+              <w:spacing w:after="40" w:before="40"/>
+              <w:jc w:val="center"/>
+            </w:pPr>
+            <w:r>
+              <w:rPr>
+                <w:rFonts w:ascii="Times New Roman" w:hAnsi="Times New Roman"/>
+                <w:b w:val="0"/>
+                <w:sz w:val="20"/>
+              </w:rPr>
+              <w:t>0.714</w:t>
+            </w:r>
+          </w:p>
+        </w:tc>
+        <w:tc>
+          <w:tcPr>
+            <w:tcW w:type="dxa" w:w="1728"/>
+          </w:tcPr>
+          <w:p>
+            <w:pPr>
+              <w:spacing w:after="40" w:before="40"/>
+              <w:jc w:val="center"/>
+            </w:pPr>
+            <w:r>
+              <w:rPr>
+                <w:rFonts w:ascii="Times New Roman" w:hAnsi="Times New Roman"/>
+                <w:b w:val="0"/>
+                <w:sz w:val="20"/>
+              </w:rPr>
+              <w:t>0.604</w:t>
+            </w:r>
+          </w:p>
+        </w:tc>
+      </w:tr>
+      <w:tr>
+        <w:tc>
+          <w:tcPr>
+            <w:tcW w:type="dxa" w:w="1728"/>
+          </w:tcPr>
+          <w:p>
+            <w:pPr>
+              <w:spacing w:after="40" w:before="40"/>
+            </w:pPr>
+            <w:r>
+              <w:rPr>
+                <w:rFonts w:ascii="Times New Roman" w:hAnsi="Times New Roman"/>
+                <w:b w:val="0"/>
+                <w:sz w:val="20"/>
+              </w:rPr>
+              <w:t>BSAT</w:t>
+            </w:r>
+          </w:p>
+        </w:tc>
+        <w:tc>
+          <w:tcPr>
+            <w:tcW w:type="dxa" w:w="1728"/>
+          </w:tcPr>
+          <w:p>
+            <w:pPr>
+              <w:spacing w:after="40" w:before="40"/>
+              <w:jc w:val="center"/>
+            </w:pPr>
+            <w:r>
+              <w:rPr>
+                <w:rFonts w:ascii="Times New Roman" w:hAnsi="Times New Roman"/>
+                <w:b w:val="0"/>
+                <w:sz w:val="20"/>
+              </w:rPr>
+              <w:t>1</w:t>
+            </w:r>
+          </w:p>
+        </w:tc>
+        <w:tc>
+          <w:tcPr>
+            <w:tcW w:type="dxa" w:w="1728"/>
+          </w:tcPr>
+          <w:p>
+            <w:pPr>
+              <w:spacing w:after="40" w:before="40"/>
+              <w:jc w:val="center"/>
+            </w:pPr>
+            <w:r>
+              <w:rPr>
+                <w:rFonts w:ascii="Times New Roman" w:hAnsi="Times New Roman"/>
+                <w:b w:val="0"/>
+                <w:sz w:val="20"/>
+              </w:rPr>
+              <w:t>0.776</w:t>
+            </w:r>
+          </w:p>
+        </w:tc>
+        <w:tc>
+          <w:tcPr>
+            <w:tcW w:type="dxa" w:w="1728"/>
+          </w:tcPr>
+          <w:p>
+            <w:pPr>
+              <w:spacing w:after="40" w:before="40"/>
+              <w:jc w:val="center"/>
+            </w:pPr>
+            <w:r>
+              <w:rPr>
+                <w:rFonts w:ascii="Times New Roman" w:hAnsi="Times New Roman"/>
+                <w:b w:val="0"/>
+                <w:sz w:val="20"/>
+              </w:rPr>
+              <w:t>0.661</w:t>
+            </w:r>
+          </w:p>
+        </w:tc>
+        <w:tc>
+          <w:tcPr>
+            <w:tcW w:type="dxa" w:w="1728"/>
+          </w:tcPr>
+          <w:p>
+            <w:pPr>
+              <w:spacing w:after="40" w:before="40"/>
+              <w:jc w:val="center"/>
+            </w:pPr>
+            <w:r>
+              <w:rPr>
+                <w:rFonts w:ascii="Times New Roman" w:hAnsi="Times New Roman"/>
+                <w:b w:val="0"/>
+                <w:sz w:val="20"/>
+              </w:rPr>
+              <w:t>0.751</w:t>
+            </w:r>
+          </w:p>
+        </w:tc>
+      </w:tr>
+      <w:tr>
+        <w:tc>
+          <w:tcPr>
+            <w:tcW w:type="dxa" w:w="1728"/>
+          </w:tcPr>
+          <w:p>
+            <w:pPr>
+              <w:spacing w:after="40" w:before="40"/>
+            </w:pPr>
+            <w:r>
+              <w:rPr>
+                <w:rFonts w:ascii="Times New Roman" w:hAnsi="Times New Roman"/>
+                <w:b w:val="0"/>
+                <w:sz w:val="20"/>
+              </w:rPr>
+              <w:t>UE · UX</w:t>
+            </w:r>
+          </w:p>
+        </w:tc>
+        <w:tc>
+          <w:tcPr>
+            <w:tcW w:type="dxa" w:w="1728"/>
+          </w:tcPr>
+          <w:p>
+            <w:pPr>
+              <w:spacing w:after="40" w:before="40"/>
+              <w:jc w:val="center"/>
+            </w:pPr>
+            <w:r>
+              <w:rPr>
+                <w:rFonts w:ascii="Times New Roman" w:hAnsi="Times New Roman"/>
+                <w:b w:val="0"/>
+                <w:sz w:val="20"/>
+              </w:rPr>
+              <w:t>2</w:t>
+            </w:r>
+          </w:p>
+        </w:tc>
+        <w:tc>
+          <w:tcPr>
+            <w:tcW w:type="dxa" w:w="1728"/>
+          </w:tcPr>
+          <w:p>
+            <w:pPr>
+              <w:spacing w:after="40" w:before="40"/>
+              <w:jc w:val="center"/>
+            </w:pPr>
+            <w:r>
+              <w:rPr>
+                <w:rFonts w:ascii="Times New Roman" w:hAnsi="Times New Roman"/>
+                <w:b w:val="0"/>
+                <w:sz w:val="20"/>
+              </w:rPr>
+              <w:t>0.774</w:t>
+            </w:r>
+          </w:p>
+        </w:tc>
+        <w:tc>
+          <w:tcPr>
+            <w:tcW w:type="dxa" w:w="1728"/>
+          </w:tcPr>
+          <w:p>
+            <w:pPr>
+              <w:spacing w:after="40" w:before="40"/>
+              <w:jc w:val="center"/>
+            </w:pPr>
+            <w:r>
+              <w:rPr>
+                <w:rFonts w:ascii="Times New Roman" w:hAnsi="Times New Roman"/>
+                <w:b w:val="0"/>
+                <w:sz w:val="20"/>
+              </w:rPr>
+              <w:t>0.620</w:t>
+            </w:r>
+          </w:p>
+        </w:tc>
+        <w:tc>
+          <w:tcPr>
+            <w:tcW w:type="dxa" w:w="1728"/>
+          </w:tcPr>
+          <w:p>
+            <w:pPr>
+              <w:spacing w:after="40" w:before="40"/>
+              <w:jc w:val="center"/>
+            </w:pPr>
+            <w:r>
+              <w:rPr>
+                <w:rFonts w:ascii="Times New Roman" w:hAnsi="Times New Roman"/>
+                <w:b w:val="0"/>
+                <w:sz w:val="20"/>
+              </w:rPr>
+              <w:t>0.566</w:t>
+            </w:r>
+          </w:p>
+        </w:tc>
+      </w:tr>
+      <w:tr>
+        <w:tc>
+          <w:tcPr>
+            <w:tcW w:type="dxa" w:w="1728"/>
+          </w:tcPr>
+          <w:p>
+            <w:pPr>
+              <w:spacing w:after="40" w:before="40"/>
+            </w:pPr>
+            <w:r>
+              <w:rPr>
+                <w:rFonts w:ascii="Times New Roman" w:hAnsi="Times New Roman"/>
+                <w:b w:val="0"/>
+                <w:sz w:val="20"/>
+              </w:rPr>
+              <w:t>UX</w:t>
+            </w:r>
+          </w:p>
+        </w:tc>
+        <w:tc>
+          <w:tcPr>
+            <w:tcW w:type="dxa" w:w="1728"/>
+          </w:tcPr>
+          <w:p>
+            <w:pPr>
+              <w:spacing w:after="40" w:before="40"/>
+              <w:jc w:val="center"/>
+            </w:pPr>
+            <w:r>
+              <w:rPr>
+                <w:rFonts w:ascii="Times New Roman" w:hAnsi="Times New Roman"/>
+                <w:b w:val="0"/>
+                <w:sz w:val="20"/>
+              </w:rPr>
+              <w:t>1</w:t>
+            </w:r>
+          </w:p>
+        </w:tc>
+        <w:tc>
+          <w:tcPr>
+            <w:tcW w:type="dxa" w:w="1728"/>
+          </w:tcPr>
+          <w:p>
+            <w:pPr>
+              <w:spacing w:after="40" w:before="40"/>
+              <w:jc w:val="center"/>
+            </w:pPr>
+            <w:r>
+              <w:rPr>
+                <w:rFonts w:ascii="Times New Roman" w:hAnsi="Times New Roman"/>
+                <w:b w:val="0"/>
+                <w:sz w:val="20"/>
+              </w:rPr>
+              <w:t>0.714</w:t>
+            </w:r>
+          </w:p>
+        </w:tc>
+        <w:tc>
+          <w:tcPr>
+            <w:tcW w:type="dxa" w:w="1728"/>
+          </w:tcPr>
+          <w:p>
+            <w:pPr>
+              <w:spacing w:after="40" w:before="40"/>
+              <w:jc w:val="center"/>
+            </w:pPr>
+            <w:r>
+              <w:rPr>
+                <w:rFonts w:ascii="Times New Roman" w:hAnsi="Times New Roman"/>
+                <w:b w:val="0"/>
+                <w:sz w:val="20"/>
+              </w:rPr>
+              <w:t>0.568</w:t>
+            </w:r>
+          </w:p>
+        </w:tc>
+        <w:tc>
+          <w:tcPr>
+            <w:tcW w:type="dxa" w:w="1728"/>
+          </w:tcPr>
+          <w:p>
+            <w:pPr>
+              <w:spacing w:after="40" w:before="40"/>
+              <w:jc w:val="center"/>
+            </w:pPr>
+            <w:r>
+              <w:rPr>
+                <w:rFonts w:ascii="Times New Roman" w:hAnsi="Times New Roman"/>
+                <w:b w:val="0"/>
+                <w:sz w:val="20"/>
+              </w:rPr>
+              <w:t>0.718</w:t>
+            </w:r>
+          </w:p>
+        </w:tc>
+      </w:tr>
+      <w:tr>
+        <w:tc>
+          <w:tcPr>
+            <w:tcW w:type="dxa" w:w="1728"/>
+          </w:tcPr>
+          <w:p>
+            <w:pPr>
+              <w:spacing w:after="40" w:before="40"/>
+            </w:pPr>
+            <w:r>
+              <w:rPr>
+                <w:rFonts w:ascii="Times New Roman" w:hAnsi="Times New Roman"/>
+                <w:b w:val="0"/>
+                <w:sz w:val="20"/>
+              </w:rPr>
+              <w:t>UE</w:t>
+            </w:r>
+          </w:p>
+        </w:tc>
+        <w:tc>
+          <w:tcPr>
+            <w:tcW w:type="dxa" w:w="1728"/>
+          </w:tcPr>
+          <w:p>
+            <w:pPr>
+              <w:spacing w:after="40" w:before="40"/>
+              <w:jc w:val="center"/>
+            </w:pPr>
+            <w:r>
+              <w:rPr>
+                <w:rFonts w:ascii="Times New Roman" w:hAnsi="Times New Roman"/>
+                <w:b w:val="0"/>
+                <w:sz w:val="20"/>
+              </w:rPr>
+              <w:t>1</w:t>
+            </w:r>
+          </w:p>
+        </w:tc>
+        <w:tc>
+          <w:tcPr>
+            <w:tcW w:type="dxa" w:w="1728"/>
+          </w:tcPr>
+          <w:p>
+            <w:pPr>
+              <w:spacing w:after="40" w:before="40"/>
+              <w:jc w:val="center"/>
+            </w:pPr>
+            <w:r>
+              <w:rPr>
+                <w:rFonts w:ascii="Times New Roman" w:hAnsi="Times New Roman"/>
+                <w:b w:val="0"/>
+                <w:sz w:val="20"/>
+              </w:rPr>
+              <w:t>0.685</w:t>
+            </w:r>
+          </w:p>
+        </w:tc>
+        <w:tc>
+          <w:tcPr>
+            <w:tcW w:type="dxa" w:w="1728"/>
+          </w:tcPr>
+          <w:p>
+            <w:pPr>
+              <w:spacing w:after="40" w:before="40"/>
+              <w:jc w:val="center"/>
+            </w:pPr>
+            <w:r>
+              <w:rPr>
+                <w:rFonts w:ascii="Times New Roman" w:hAnsi="Times New Roman"/>
+                <w:b w:val="0"/>
+                <w:sz w:val="20"/>
+              </w:rPr>
+              <w:t>0.530</w:t>
+            </w:r>
+          </w:p>
+        </w:tc>
+        <w:tc>
+          <w:tcPr>
+            <w:tcW w:type="dxa" w:w="1728"/>
+          </w:tcPr>
+          <w:p>
+            <w:pPr>
+              <w:spacing w:after="40" w:before="40"/>
+              <w:jc w:val="center"/>
+            </w:pPr>
+            <w:r>
+              <w:rPr>
+                <w:rFonts w:ascii="Times New Roman" w:hAnsi="Times New Roman"/>
+                <w:b w:val="0"/>
+                <w:sz w:val="20"/>
+              </w:rPr>
+              <w:t>0.698</w:t>
+            </w:r>
+          </w:p>
+        </w:tc>
+      </w:tr>
+    </w:tbl>
+    <w:p>
+      <w:pPr>
+        <w:spacing w:after="160"/>
+        <w:jc w:val="both"/>
+      </w:pPr>
+      <w:r>
+        <w:rPr>
+          <w:rFonts w:ascii="Times New Roman" w:hAnsi="Times New Roman"/>
+          <w:i w:val="0"/>
+          <w:sz w:val="24"/>
+        </w:rPr>
+        <w:t>Table 13b presents the same result in the configuration format conventionally used to report fsQCA solutions for a focal outcome (Fiss, 2011; Ragin, 2008), i.e. as a single column describing the recipe for high Brand Success (BSUC) in the metaverse, the role of each condition (core vs. peripheral), and the associated consistency and coverage metrics. Because the parsimonious and intermediate solutions coincide, all three conditions are core.</w:t>
+      </w:r>
+    </w:p>
+    <w:p>
+      <w:pPr>
+        <w:spacing w:after="80"/>
+      </w:pPr>
+      <w:r>
+        <w:rPr>
+          <w:rFonts w:ascii="Times New Roman" w:hAnsi="Times New Roman"/>
+          <w:b/>
+          <w:sz w:val="22"/>
+        </w:rPr>
+        <w:t>Table 13b. Configuration analysis for high Brand Success (BSUC) in the metaverse.</w:t>
+      </w:r>
+    </w:p>
+    <w:tbl>
+      <w:tblPr>
+        <w:tblStyle w:val="TableGrid"/>
+        <w:tblW w:type="auto" w:w="0"/>
+        <w:jc w:val="center"/>
+        <w:tblLook w:firstColumn="1" w:firstRow="1" w:lastColumn="0" w:lastRow="0" w:noHBand="0" w:noVBand="1" w:val="04A0"/>
+      </w:tblPr>
+      <w:tblGrid>
+        <w:gridCol w:w="4320"/>
+        <w:gridCol w:w="4320"/>
+      </w:tblGrid>
+      <w:tr>
+        <w:tc>
+          <w:tcPr>
+            <w:tcW w:type="dxa" w:w="4320"/>
+            <w:shd w:val="clear" w:color="auto" w:fill="DDDDDD"/>
+          </w:tcPr>
+          <w:p>
+            <w:pPr>
+              <w:spacing w:after="40" w:before="40"/>
+            </w:pPr>
+            <w:r>
+              <w:rPr>
+                <w:rFonts w:ascii="Times New Roman" w:hAnsi="Times New Roman"/>
+                <w:b/>
+                <w:sz w:val="22"/>
+              </w:rPr>
+              <w:t>Condition / Metric</w:t>
+            </w:r>
+          </w:p>
+        </w:tc>
+        <w:tc>
+          <w:tcPr>
+            <w:tcW w:type="dxa" w:w="4320"/>
+            <w:shd w:val="clear" w:color="auto" w:fill="DDDDDD"/>
+          </w:tcPr>
+          <w:p>
+            <w:pPr>
+              <w:spacing w:after="40" w:before="40"/>
+              <w:jc w:val="center"/>
+            </w:pPr>
+            <w:r>
+              <w:rPr>
+                <w:rFonts w:ascii="Times New Roman" w:hAnsi="Times New Roman"/>
+                <w:b/>
+                <w:sz w:val="22"/>
+              </w:rPr>
+              <w:t>Configuration 1</w:t>
+            </w:r>
+          </w:p>
+        </w:tc>
+      </w:tr>
+      <w:tr>
+        <w:tc>
+          <w:tcPr>
+            <w:tcW w:type="dxa" w:w="4320"/>
+          </w:tcPr>
+          <w:p>
+            <w:pPr>
+              <w:spacing w:after="40" w:before="40"/>
+            </w:pPr>
+            <w:r>
+              <w:rPr>
+                <w:rFonts w:ascii="Times New Roman" w:hAnsi="Times New Roman"/>
+                <w:b w:val="0"/>
+                <w:sz w:val="22"/>
+              </w:rPr>
+              <w:t>User Engagement (UE)</w:t>
+            </w:r>
+          </w:p>
+        </w:tc>
+        <w:tc>
+          <w:tcPr>
+            <w:tcW w:type="dxa" w:w="4320"/>
+          </w:tcPr>
+          <w:p>
+            <w:pPr>
+              <w:spacing w:after="40" w:before="40"/>
+              <w:jc w:val="center"/>
+            </w:pPr>
+            <w:r>
+              <w:rPr>
+                <w:rFonts w:ascii="Times New Roman" w:hAnsi="Times New Roman"/>
+                <w:b w:val="0"/>
+                <w:sz w:val="22"/>
+              </w:rPr>
+              <w:t>● (core)</w:t>
+            </w:r>
+          </w:p>
+        </w:tc>
+      </w:tr>
+      <w:tr>
+        <w:tc>
+          <w:tcPr>
+            <w:tcW w:type="dxa" w:w="4320"/>
+          </w:tcPr>
+          <w:p>
+            <w:pPr>
+              <w:spacing w:after="40" w:before="40"/>
+            </w:pPr>
+            <w:r>
+              <w:rPr>
+                <w:rFonts w:ascii="Times New Roman" w:hAnsi="Times New Roman"/>
+                <w:b w:val="0"/>
+                <w:sz w:val="22"/>
+              </w:rPr>
+              <w:t>User Experience (UX)</w:t>
+            </w:r>
+          </w:p>
+        </w:tc>
+        <w:tc>
+          <w:tcPr>
+            <w:tcW w:type="dxa" w:w="4320"/>
+          </w:tcPr>
+          <w:p>
+            <w:pPr>
+              <w:spacing w:after="40" w:before="40"/>
+              <w:jc w:val="center"/>
+            </w:pPr>
+            <w:r>
+              <w:rPr>
+                <w:rFonts w:ascii="Times New Roman" w:hAnsi="Times New Roman"/>
+                <w:b w:val="0"/>
+                <w:sz w:val="22"/>
+              </w:rPr>
+              <w:t>● (core)</w:t>
+            </w:r>
+          </w:p>
+        </w:tc>
+      </w:tr>
+      <w:tr>
+        <w:tc>
+          <w:tcPr>
+            <w:tcW w:type="dxa" w:w="4320"/>
+          </w:tcPr>
+          <w:p>
+            <w:pPr>
+              <w:spacing w:after="40" w:before="40"/>
+            </w:pPr>
+            <w:r>
+              <w:rPr>
+                <w:rFonts w:ascii="Times New Roman" w:hAnsi="Times New Roman"/>
+                <w:b w:val="0"/>
+                <w:sz w:val="22"/>
+              </w:rPr>
+              <w:t>Brand Satisfaction (BSAT)</w:t>
+            </w:r>
+          </w:p>
+        </w:tc>
+        <w:tc>
+          <w:tcPr>
+            <w:tcW w:type="dxa" w:w="4320"/>
+          </w:tcPr>
+          <w:p>
+            <w:pPr>
+              <w:spacing w:after="40" w:before="40"/>
+              <w:jc w:val="center"/>
+            </w:pPr>
+            <w:r>
+              <w:rPr>
+                <w:rFonts w:ascii="Times New Roman" w:hAnsi="Times New Roman"/>
+                <w:b w:val="0"/>
+                <w:sz w:val="22"/>
+              </w:rPr>
+              <w:t>● (core)</w:t>
+            </w:r>
+          </w:p>
+        </w:tc>
+      </w:tr>
+      <w:tr>
+        <w:tc>
+          <w:tcPr>
+            <w:tcW w:type="dxa" w:w="4320"/>
+          </w:tcPr>
+          <w:p>
+            <w:pPr>
+              <w:spacing w:after="40" w:before="40"/>
+            </w:pPr>
+            <w:r>
+              <w:rPr>
+                <w:rFonts w:ascii="Times New Roman" w:hAnsi="Times New Roman"/>
+                <w:b w:val="0"/>
+                <w:sz w:val="22"/>
+              </w:rPr>
+              <w:t>Raw coverage</w:t>
+            </w:r>
+          </w:p>
+        </w:tc>
+        <w:tc>
+          <w:tcPr>
+            <w:tcW w:type="dxa" w:w="4320"/>
+          </w:tcPr>
+          <w:p>
+            <w:pPr>
+              <w:spacing w:after="40" w:before="40"/>
+              <w:jc w:val="center"/>
+            </w:pPr>
+            <w:r>
+              <w:rPr>
+                <w:rFonts w:ascii="Times New Roman" w:hAnsi="Times New Roman"/>
+                <w:b w:val="0"/>
+                <w:sz w:val="22"/>
+              </w:rPr>
+              <w:t>0.497</w:t>
+            </w:r>
+          </w:p>
+        </w:tc>
+      </w:tr>
+      <w:tr>
+        <w:tc>
+          <w:tcPr>
+            <w:tcW w:type="dxa" w:w="4320"/>
+          </w:tcPr>
+          <w:p>
+            <w:pPr>
+              <w:spacing w:after="40" w:before="40"/>
+            </w:pPr>
+            <w:r>
+              <w:rPr>
+                <w:rFonts w:ascii="Times New Roman" w:hAnsi="Times New Roman"/>
+                <w:b w:val="0"/>
+                <w:sz w:val="22"/>
+              </w:rPr>
+              <w:t>Unique coverage</w:t>
+            </w:r>
+          </w:p>
+        </w:tc>
+        <w:tc>
+          <w:tcPr>
+            <w:tcW w:type="dxa" w:w="4320"/>
+          </w:tcPr>
+          <w:p>
+            <w:pPr>
+              <w:spacing w:after="40" w:before="40"/>
+              <w:jc w:val="center"/>
+            </w:pPr>
+            <w:r>
+              <w:rPr>
+                <w:rFonts w:ascii="Times New Roman" w:hAnsi="Times New Roman"/>
+                <w:b w:val="0"/>
+                <w:sz w:val="22"/>
+              </w:rPr>
+              <w:t>0.497</w:t>
+            </w:r>
+          </w:p>
+        </w:tc>
+      </w:tr>
+      <w:tr>
+        <w:tc>
+          <w:tcPr>
+            <w:tcW w:type="dxa" w:w="4320"/>
+          </w:tcPr>
+          <w:p>
+            <w:pPr>
+              <w:spacing w:after="40" w:before="40"/>
+            </w:pPr>
+            <w:r>
+              <w:rPr>
+                <w:rFonts w:ascii="Times New Roman" w:hAnsi="Times New Roman"/>
+                <w:b w:val="0"/>
+                <w:sz w:val="22"/>
+              </w:rPr>
+              <w:t>Configuration consistency</w:t>
+            </w:r>
+          </w:p>
+        </w:tc>
+        <w:tc>
+          <w:tcPr>
+            <w:tcW w:type="dxa" w:w="4320"/>
+          </w:tcPr>
+          <w:p>
+            <w:pPr>
+              <w:spacing w:after="40" w:before="40"/>
+              <w:jc w:val="center"/>
+            </w:pPr>
+            <w:r>
+              <w:rPr>
+                <w:rFonts w:ascii="Times New Roman" w:hAnsi="Times New Roman"/>
+                <w:b w:val="0"/>
+                <w:sz w:val="22"/>
+              </w:rPr>
+              <w:t>0.857</w:t>
+            </w:r>
+          </w:p>
+        </w:tc>
+      </w:tr>
+      <w:tr>
+        <w:tc>
+          <w:tcPr>
+            <w:tcW w:type="dxa" w:w="4320"/>
+          </w:tcPr>
+          <w:p>
+            <w:pPr>
+              <w:spacing w:after="40" w:before="40"/>
+            </w:pPr>
+            <w:r>
+              <w:rPr>
+                <w:rFonts w:ascii="Times New Roman" w:hAnsi="Times New Roman"/>
+                <w:b w:val="0"/>
+                <w:sz w:val="22"/>
+              </w:rPr>
+              <w:t>Overall solution coverage</w:t>
+            </w:r>
+          </w:p>
+        </w:tc>
+        <w:tc>
+          <w:tcPr>
+            <w:tcW w:type="dxa" w:w="4320"/>
+          </w:tcPr>
+          <w:p>
+            <w:pPr>
+              <w:spacing w:after="40" w:before="40"/>
+              <w:jc w:val="center"/>
+            </w:pPr>
+            <w:r>
+              <w:rPr>
+                <w:rFonts w:ascii="Times New Roman" w:hAnsi="Times New Roman"/>
+                <w:b w:val="0"/>
+                <w:sz w:val="22"/>
+              </w:rPr>
+              <w:t>0.497</w:t>
+            </w:r>
+          </w:p>
+        </w:tc>
+      </w:tr>
+      <w:tr>
+        <w:tc>
+          <w:tcPr>
+            <w:tcW w:type="dxa" w:w="4320"/>
+          </w:tcPr>
+          <w:p>
+            <w:pPr>
+              <w:spacing w:after="40" w:before="40"/>
+            </w:pPr>
+            <w:r>
+              <w:rPr>
+                <w:rFonts w:ascii="Times New Roman" w:hAnsi="Times New Roman"/>
+                <w:b w:val="0"/>
+                <w:sz w:val="22"/>
+              </w:rPr>
+              <w:t>Overall solution consistency</w:t>
+            </w:r>
+          </w:p>
+        </w:tc>
+        <w:tc>
+          <w:tcPr>
+            <w:tcW w:type="dxa" w:w="4320"/>
+          </w:tcPr>
+          <w:p>
+            <w:pPr>
+              <w:spacing w:after="40" w:before="40"/>
+              <w:jc w:val="center"/>
+            </w:pPr>
+            <w:r>
+              <w:rPr>
+                <w:rFonts w:ascii="Times New Roman" w:hAnsi="Times New Roman"/>
+                <w:b w:val="0"/>
+                <w:sz w:val="22"/>
+              </w:rPr>
+              <w:t>0.857</w:t>
+            </w:r>
+          </w:p>
+        </w:tc>
+      </w:tr>
+    </w:tbl>
+    <w:p>
+      <w:pPr>
+        <w:spacing w:after="200"/>
+      </w:pPr>
+      <w:r>
+        <w:rPr>
+          <w:rFonts w:ascii="Times New Roman" w:hAnsi="Times New Roman"/>
+          <w:i/>
+          <w:sz w:val="20"/>
+        </w:rPr>
+        <w:t>Notation: ● = core causal condition (present in both the parsimonious and the intermediate solution); blank = absent or “don't care”. Frequency threshold = 4 cases; raw-consistency threshold = 0.80; PRI threshold = 0.70.</w:t>
       </w:r>
     </w:p>
     <w:p>

</xml_diff>